<commit_message>
Update Alejandro CV Network Engineer.docx
</commit_message>
<xml_diff>
--- a/Alejandro CV Network Engineer.docx
+++ b/Alejandro CV Network Engineer.docx
@@ -91,32 +91,14 @@
         </w:rPr>
       </w:pPr>
       <w:hyperlink r:id="rId7">
-        <w:proofErr w:type="spellStart"/>
         <w:r>
           <w:rPr>
             <w:rFonts w:ascii="Roboto" w:eastAsia="Roboto" w:hAnsi="Roboto" w:cs="Roboto"/>
             <w:color w:val="1155CC"/>
             <w:u w:val="single"/>
           </w:rPr>
-          <w:t>L</w:t>
+          <w:t>Linkedin</w:t>
         </w:r>
-        <w:r>
-          <w:rPr>
-            <w:rFonts w:ascii="Roboto" w:eastAsia="Roboto" w:hAnsi="Roboto" w:cs="Roboto"/>
-            <w:color w:val="1155CC"/>
-            <w:u w:val="single"/>
-          </w:rPr>
-          <w:t>i</w:t>
-        </w:r>
-        <w:r>
-          <w:rPr>
-            <w:rFonts w:ascii="Roboto" w:eastAsia="Roboto" w:hAnsi="Roboto" w:cs="Roboto"/>
-            <w:color w:val="1155CC"/>
-            <w:u w:val="single"/>
-          </w:rPr>
-          <w:t>nkedin</w:t>
-        </w:r>
-        <w:proofErr w:type="spellEnd"/>
       </w:hyperlink>
     </w:p>
     <w:p>
@@ -165,7 +147,16 @@
           <w:rFonts w:ascii="Roboto" w:eastAsia="Roboto" w:hAnsi="Roboto" w:cs="Roboto"/>
           <w:color w:val="666666"/>
         </w:rPr>
-        <w:t>Telephone:</w:t>
+        <w:t>Mobile</w:t>
+      </w:r>
+      <w:bookmarkStart w:id="2" w:name="_GoBack"/>
+      <w:bookmarkEnd w:id="2"/>
+      <w:r>
+        <w:rPr>
+          <w:rFonts w:ascii="Roboto" w:eastAsia="Roboto" w:hAnsi="Roboto" w:cs="Roboto"/>
+          <w:color w:val="666666"/>
+        </w:rPr>
+        <w:t>:</w:t>
       </w:r>
       <w:r>
         <w:rPr>
@@ -377,8 +368,6 @@
         </w:rPr>
         <w:t>Technical skills</w:t>
       </w:r>
-      <w:bookmarkStart w:id="2" w:name="_GoBack"/>
-      <w:bookmarkEnd w:id="2"/>
     </w:p>
     <w:p>
       <w:pPr>
@@ -423,21 +412,7 @@
         <w:rPr>
           <w:rFonts w:ascii="Roboto" w:eastAsia="Roboto" w:hAnsi="Roboto" w:cs="Roboto"/>
         </w:rPr>
-        <w:t xml:space="preserve">NetBrain (Deployment, administration, creation of </w:t>
-      </w:r>
-      <w:proofErr w:type="spellStart"/>
-      <w:r>
-        <w:rPr>
-          <w:rFonts w:ascii="Roboto" w:eastAsia="Roboto" w:hAnsi="Roboto" w:cs="Roboto"/>
-        </w:rPr>
-        <w:t>Qapps</w:t>
-      </w:r>
-      <w:proofErr w:type="spellEnd"/>
-      <w:r>
-        <w:rPr>
-          <w:rFonts w:ascii="Roboto" w:eastAsia="Roboto" w:hAnsi="Roboto" w:cs="Roboto"/>
-        </w:rPr>
-        <w:t xml:space="preserve"> and parsers, API integration).</w:t>
+        <w:t>NetBrain (Deployment, administration, creation of Qapps and parsers, API integration).</w:t>
       </w:r>
     </w:p>
     <w:p>
@@ -517,13 +492,7 @@
         <w:rPr>
           <w:rFonts w:ascii="Roboto" w:eastAsia="Roboto" w:hAnsi="Roboto" w:cs="Roboto"/>
         </w:rPr>
-        <w:t>Cisco Routers (DMVPNs, site to site VPNs, zone based firewalls, EIGRP</w:t>
-      </w:r>
-      <w:r>
-        <w:rPr>
-          <w:rFonts w:ascii="Roboto" w:eastAsia="Roboto" w:hAnsi="Roboto" w:cs="Roboto"/>
-        </w:rPr>
-        <w:t>, OSPF, BGP)</w:t>
+        <w:t>Cisco Routers (DMVPNs, site to site VPNs, zone based firewalls, EIGRP, OSPF, BGP)</w:t>
       </w:r>
     </w:p>
     <w:p>
@@ -599,21 +568,7 @@
         <w:rPr>
           <w:rFonts w:ascii="Roboto" w:eastAsia="Roboto" w:hAnsi="Roboto" w:cs="Roboto"/>
         </w:rPr>
-        <w:t>Nexus switches (</w:t>
-      </w:r>
-      <w:proofErr w:type="spellStart"/>
-      <w:r>
-        <w:rPr>
-          <w:rFonts w:ascii="Roboto" w:eastAsia="Roboto" w:hAnsi="Roboto" w:cs="Roboto"/>
-        </w:rPr>
-        <w:t>vpc</w:t>
-      </w:r>
-      <w:proofErr w:type="spellEnd"/>
-      <w:r>
-        <w:rPr>
-          <w:rFonts w:ascii="Roboto" w:eastAsia="Roboto" w:hAnsi="Roboto" w:cs="Roboto"/>
-        </w:rPr>
-        <w:t>, port channels, software upgrades)</w:t>
+        <w:t>Nexus switches (vpc, port channels, software upgrades)</w:t>
       </w:r>
     </w:p>
     <w:p>
@@ -673,13 +628,7 @@
         <w:rPr>
           <w:rFonts w:ascii="Roboto" w:eastAsia="Roboto" w:hAnsi="Roboto" w:cs="Roboto"/>
         </w:rPr>
-        <w:t>Catalyst 6500 (VSS, supervisor</w:t>
-      </w:r>
-      <w:r>
-        <w:rPr>
-          <w:rFonts w:ascii="Roboto" w:eastAsia="Roboto" w:hAnsi="Roboto" w:cs="Roboto"/>
-        </w:rPr>
-        <w:t>s, line cards, FWSM)</w:t>
+        <w:t>Catalyst 6500 (VSS, supervisors, line cards, FWSM)</w:t>
       </w:r>
     </w:p>
     <w:p>
@@ -715,47 +664,11 @@
           <w:rFonts w:ascii="Roboto" w:eastAsia="Roboto" w:hAnsi="Roboto" w:cs="Roboto"/>
         </w:rPr>
       </w:pPr>
-      <w:proofErr w:type="spellStart"/>
-      <w:r>
-        <w:rPr>
-          <w:rFonts w:ascii="Roboto" w:eastAsia="Roboto" w:hAnsi="Roboto" w:cs="Roboto"/>
-        </w:rPr>
-        <w:t>Vmware</w:t>
-      </w:r>
-      <w:proofErr w:type="spellEnd"/>
-      <w:r>
-        <w:rPr>
-          <w:rFonts w:ascii="Roboto" w:eastAsia="Roboto" w:hAnsi="Roboto" w:cs="Roboto"/>
-        </w:rPr>
-        <w:t xml:space="preserve"> hypervisors (ESXI and </w:t>
-      </w:r>
-      <w:proofErr w:type="spellStart"/>
-      <w:r>
-        <w:rPr>
-          <w:rFonts w:ascii="Roboto" w:eastAsia="Roboto" w:hAnsi="Roboto" w:cs="Roboto"/>
-        </w:rPr>
-        <w:t>vCentre</w:t>
-      </w:r>
-      <w:proofErr w:type="spellEnd"/>
-      <w:r>
-        <w:rPr>
-          <w:rFonts w:ascii="Roboto" w:eastAsia="Roboto" w:hAnsi="Roboto" w:cs="Roboto"/>
-        </w:rPr>
-        <w:t xml:space="preserve"> management, </w:t>
-      </w:r>
-      <w:proofErr w:type="spellStart"/>
-      <w:r>
-        <w:rPr>
-          <w:rFonts w:ascii="Roboto" w:eastAsia="Roboto" w:hAnsi="Roboto" w:cs="Roboto"/>
-        </w:rPr>
-        <w:t>vSwitches</w:t>
-      </w:r>
-      <w:proofErr w:type="spellEnd"/>
-      <w:r>
-        <w:rPr>
-          <w:rFonts w:ascii="Roboto" w:eastAsia="Roboto" w:hAnsi="Roboto" w:cs="Roboto"/>
-        </w:rPr>
-        <w:t>, port-groups)</w:t>
+      <w:r>
+        <w:rPr>
+          <w:rFonts w:ascii="Roboto" w:eastAsia="Roboto" w:hAnsi="Roboto" w:cs="Roboto"/>
+        </w:rPr>
+        <w:t>Vmware hypervisors (ESXI and vCentre management, vSwitches, port-groups)</w:t>
       </w:r>
     </w:p>
     <w:p>
@@ -795,55 +708,7 @@
         <w:rPr>
           <w:rFonts w:ascii="Roboto" w:eastAsia="Roboto" w:hAnsi="Roboto" w:cs="Roboto"/>
         </w:rPr>
-        <w:t>SIEM tools integration (</w:t>
-      </w:r>
-      <w:proofErr w:type="spellStart"/>
-      <w:r>
-        <w:rPr>
-          <w:rFonts w:ascii="Roboto" w:eastAsia="Roboto" w:hAnsi="Roboto" w:cs="Roboto"/>
-        </w:rPr>
-        <w:t>splunk</w:t>
-      </w:r>
-      <w:proofErr w:type="spellEnd"/>
-      <w:r>
-        <w:rPr>
-          <w:rFonts w:ascii="Roboto" w:eastAsia="Roboto" w:hAnsi="Roboto" w:cs="Roboto"/>
-        </w:rPr>
-        <w:t xml:space="preserve">, </w:t>
-      </w:r>
-      <w:proofErr w:type="spellStart"/>
-      <w:r>
-        <w:rPr>
-          <w:rFonts w:ascii="Roboto" w:eastAsia="Roboto" w:hAnsi="Roboto" w:cs="Roboto"/>
-        </w:rPr>
-        <w:t>logrhythm</w:t>
-      </w:r>
-      <w:proofErr w:type="spellEnd"/>
-      <w:r>
-        <w:rPr>
-          <w:rFonts w:ascii="Roboto" w:eastAsia="Roboto" w:hAnsi="Roboto" w:cs="Roboto"/>
-        </w:rPr>
-        <w:t xml:space="preserve">, </w:t>
-      </w:r>
-      <w:proofErr w:type="spellStart"/>
-      <w:r>
-        <w:rPr>
-          <w:rFonts w:ascii="Roboto" w:eastAsia="Roboto" w:hAnsi="Roboto" w:cs="Roboto"/>
-        </w:rPr>
-        <w:t>logicm</w:t>
-      </w:r>
-      <w:r>
-        <w:rPr>
-          <w:rFonts w:ascii="Roboto" w:eastAsia="Roboto" w:hAnsi="Roboto" w:cs="Roboto"/>
-        </w:rPr>
-        <w:t>onitor</w:t>
-      </w:r>
-      <w:proofErr w:type="spellEnd"/>
-      <w:r>
-        <w:rPr>
-          <w:rFonts w:ascii="Roboto" w:eastAsia="Roboto" w:hAnsi="Roboto" w:cs="Roboto"/>
-        </w:rPr>
-        <w:t>)</w:t>
+        <w:t>SIEM tools integration (splunk, logrhythm, logicmonitor)</w:t>
       </w:r>
     </w:p>
     <w:p>
@@ -859,19 +724,11 @@
           <w:rFonts w:ascii="Roboto" w:eastAsia="Roboto" w:hAnsi="Roboto" w:cs="Roboto"/>
         </w:rPr>
       </w:pPr>
-      <w:proofErr w:type="spellStart"/>
-      <w:r>
-        <w:rPr>
-          <w:rFonts w:ascii="Roboto" w:eastAsia="Roboto" w:hAnsi="Roboto" w:cs="Roboto"/>
-        </w:rPr>
-        <w:t>Solarwinds</w:t>
-      </w:r>
-      <w:proofErr w:type="spellEnd"/>
-      <w:r>
-        <w:rPr>
-          <w:rFonts w:ascii="Roboto" w:eastAsia="Roboto" w:hAnsi="Roboto" w:cs="Roboto"/>
-        </w:rPr>
-        <w:t>, UIM</w:t>
+      <w:r>
+        <w:rPr>
+          <w:rFonts w:ascii="Roboto" w:eastAsia="Roboto" w:hAnsi="Roboto" w:cs="Roboto"/>
+        </w:rPr>
+        <w:t>Solarwinds, UIM</w:t>
       </w:r>
     </w:p>
     <w:p>
@@ -923,7 +780,6 @@
           <w:rFonts w:ascii="Roboto" w:eastAsia="Roboto" w:hAnsi="Roboto" w:cs="Roboto"/>
         </w:rPr>
       </w:pPr>
-      <w:proofErr w:type="spellStart"/>
       <w:r>
         <w:rPr>
           <w:rFonts w:ascii="Roboto" w:eastAsia="Roboto" w:hAnsi="Roboto" w:cs="Roboto"/>
@@ -936,7 +792,6 @@
         </w:rPr>
         <w:t>Dev</w:t>
       </w:r>
-      <w:proofErr w:type="spellEnd"/>
     </w:p>
     <w:p>
       <w:pPr>
@@ -1100,31 +955,7 @@
           <w:sz w:val="24"/>
           <w:szCs w:val="24"/>
         </w:rPr>
-        <w:t>October</w:t>
-      </w:r>
-      <w:r>
-        <w:rPr>
-          <w:rFonts w:ascii="Roboto" w:eastAsia="Roboto" w:hAnsi="Roboto" w:cs="Roboto"/>
-          <w:sz w:val="24"/>
-          <w:szCs w:val="24"/>
-        </w:rPr>
-        <w:t xml:space="preserve"> 201</w:t>
-      </w:r>
-      <w:r>
-        <w:rPr>
-          <w:rFonts w:ascii="Roboto" w:eastAsia="Roboto" w:hAnsi="Roboto" w:cs="Roboto"/>
-          <w:sz w:val="24"/>
-          <w:szCs w:val="24"/>
-        </w:rPr>
-        <w:t xml:space="preserve">9 </w:t>
-      </w:r>
-      <w:r>
-        <w:rPr>
-          <w:rFonts w:ascii="Roboto" w:eastAsia="Roboto" w:hAnsi="Roboto" w:cs="Roboto"/>
-          <w:sz w:val="24"/>
-          <w:szCs w:val="24"/>
-        </w:rPr>
-        <w:t xml:space="preserve">– Present  </w:t>
+        <w:t xml:space="preserve">October 2019 – Present  </w:t>
       </w:r>
       <w:r>
         <w:rPr>
@@ -1636,13 +1467,7 @@
         <w:rPr>
           <w:rFonts w:ascii="Roboto" w:eastAsia="Roboto" w:hAnsi="Roboto" w:cs="Roboto"/>
         </w:rPr>
-        <w:t>Adv</w:t>
-      </w:r>
-      <w:r>
-        <w:rPr>
-          <w:rFonts w:ascii="Roboto" w:eastAsia="Roboto" w:hAnsi="Roboto" w:cs="Roboto"/>
-        </w:rPr>
-        <w:t>ises customers on implementations, configurations and software upgrades as per best practices.</w:t>
+        <w:t>Advises customers on implementations, configurations and software upgrades as per best practices.</w:t>
       </w:r>
     </w:p>
     <w:p>
@@ -1841,13 +1666,7 @@
         <w:rPr>
           <w:rFonts w:ascii="Roboto" w:eastAsia="Roboto" w:hAnsi="Roboto" w:cs="Roboto"/>
         </w:rPr>
-        <w:t>Conducted</w:t>
-      </w:r>
-      <w:r>
-        <w:rPr>
-          <w:rFonts w:ascii="Roboto" w:eastAsia="Roboto" w:hAnsi="Roboto" w:cs="Roboto"/>
-        </w:rPr>
-        <w:t xml:space="preserve"> implementations following  standardised change management processes based on ITIL principles.</w:t>
+        <w:t>Conducted implementations following  standardised change management processes based on ITIL principles.</w:t>
       </w:r>
     </w:p>
     <w:p>
@@ -1867,27 +1686,7 @@
         <w:rPr>
           <w:rFonts w:ascii="Roboto" w:eastAsia="Roboto" w:hAnsi="Roboto" w:cs="Roboto"/>
         </w:rPr>
-        <w:t xml:space="preserve">Implemented a backup solution using the </w:t>
-      </w:r>
-      <w:proofErr w:type="spellStart"/>
-      <w:r>
-        <w:rPr>
-          <w:rFonts w:ascii="Roboto" w:eastAsia="Roboto" w:hAnsi="Roboto" w:cs="Roboto"/>
-        </w:rPr>
-        <w:t>Paramiko</w:t>
-      </w:r>
-      <w:proofErr w:type="spellEnd"/>
-      <w:r>
-        <w:rPr>
-          <w:rFonts w:ascii="Roboto" w:eastAsia="Roboto" w:hAnsi="Roboto" w:cs="Roboto"/>
-        </w:rPr>
-        <w:t xml:space="preserve"> python library. It remotes to a list of devices and executes a series of show commands, the output of these are </w:t>
-      </w:r>
-      <w:r>
-        <w:rPr>
-          <w:rFonts w:ascii="Roboto" w:eastAsia="Roboto" w:hAnsi="Roboto" w:cs="Roboto"/>
-        </w:rPr>
-        <w:t>saved to a text file with the device name and a timestamp.</w:t>
+        <w:t>Implemented a backup solution using the Paramiko python library. It remotes to a list of devices and executes a series of show commands, the output of these are saved to a text file with the device name and a timestamp.</w:t>
       </w:r>
     </w:p>
     <w:p>

</xml_diff>